<commit_message>
Docs: refresh Barter and PAYROLL Classes documentation
Barter now covers the instructor fallback, Desjardins ID fields, Payroll period
checks and the MTEK Profile link. The live PAYROLL Classes doc covers pay period
assignment; the bcycle-payroll-classes.yml doc now says it never runs (its YAML
doesn't parse) instead of warning that it double-fires.

Co-Authored-By: Claude Opus 5 <noreply@anthropic.com>
</commit_message>
<xml_diff>
--- a/docs/HR_Payroll_Barter_Documentation.docx
+++ b/docs/HR_Payroll_Barter_Documentation.docx
@@ -20,7 +20,7 @@
     </w:p>
     <w:p>
       <w:r>
-        <w:t xml:space="preserve">This action writes to the HR base (appiwfeujJzUZPPBx). The Employees table also exists in HR - Instructors with different IDs and fields; instructors whose only record is there will not match.</w:t>
+        <w:t xml:space="preserve">This action writes to the HR base (appiwfeujJzUZPPBx). HR - Instructors is a different base; the Instructors table this action matches against is the one inside the HR base (tblGfu4QRovWm7oX0).</w:t>
       </w:r>
     </w:p>
     <w:p>
@@ -33,7 +33,7 @@
     </w:p>
     <w:p>
       <w:r>
-        <w:t xml:space="preserve">Imports staff barter — MTEK promotion BARTER, promo code TEAMBARTER — into the Barter table, one row per redemption, linked to the Payroll period it falls in and to the employee who used it. It replaces downloading the Promotion Redemptions CSV by hand.</w:t>
+        <w:t xml:space="preserve">Imports staff barter — MTEK promotion BARTER, promo code TEAMBARTER — into the Barter table, one row per redemption, linked to the Payroll period it falls in and to the employee or instructor who used it, with their Desjardins ID. It replaces downloading the Promotion Redemptions CSV by hand.</w:t>
       </w:r>
     </w:p>
     <w:p>
@@ -66,7 +66,12 @@
     </w:p>
     <w:p>
       <w:r>
-        <w:t xml:space="preserve">- Each redemption is matched to an active employee; the period's statuses and Barter Notes are updated.</w:t>
+        <w:t xml:space="preserve">- Each redemption is matched to an active employee, or failing that to an instructor; the period's statuses and Barter Notes are updated.</w:t>
+      </w:r>
+    </w:p>
+    <w:p>
+      <w:r>
+        <w:t xml:space="preserve">- Airtable formulas and rollups then flag, per period, redemptions with nobody linked, no Desjardins ID, or a date outside the period.</w:t>
       </w:r>
     </w:p>
     <w:p>
@@ -125,7 +130,7 @@
     </w:p>
     <w:p>
       <w:r>
-        <w:t xml:space="preserve">- Set in the workflow: AIRTABLE_BASE_ID, AIRTABLE_PAYROLL_PERIODS_TABLE_ID (tbl9qw4kqw0BY0DyJ), AIRTABLE_BARTER_TABLE_ID (tblYxeSSem1plIvIR), AIRTABLE_EMPLOYEES_TABLE_ID, AIRTABLE_EMPLOYEES_VIEW_ID (viws8tSbvXfujLnwG), MTEK_BASE_URL, MTEK_BARTER_REPORT_ID (292), MTEK_BARTER_REPORT_SLUG, BARTER_PROMOTION (BARTER), PAYROLL_TIME_ZONE.</w:t>
+        <w:t xml:space="preserve">- Set in the workflow: AIRTABLE_BASE_ID, AIRTABLE_PAYROLL_PERIODS_TABLE_ID (tbl9qw4kqw0BY0DyJ), AIRTABLE_BARTER_TABLE_ID (tblYxeSSem1plIvIR), AIRTABLE_EMPLOYEES_TABLE_ID, AIRTABLE_EMPLOYEES_VIEW_ID (viws8tSbvXfujLnwG), MTEK_BASE_URL, MTEK_BARTER_REPORT_ID (292), MTEK_BARTER_REPORT_SLUG, BARTER_PROMOTION (BARTER), PAYROLL_TIME_ZONE. The Instructors table ID (tblGfu4QRovWm7oX0) defaults in the script; AIRTABLE_INSTRUCTORS_TABLE_ID overrides it.</w:t>
       </w:r>
     </w:p>
     <w:p>
@@ -143,7 +148,7 @@
     </w:p>
     <w:p>
       <w:r>
-        <w:t xml:space="preserve">scripts/hr-payroll-barter-workflow.mjs. Sets the statuses to Started, reads the period dates, runs the report, and fails if it returns no redemptions at all (any promotion). Keeps rows whose Promotion is BARTER (trimmed, case-insensitive) and whose Date is inside the period. Refuses to run if any column it reads is missing from the report, or if a BARTER row has no Order Number. Creates new rows, then matches employees and writes the final statuses and a Notes entry. HR_BARTER_SKIP_RUN=1 lets barterRowsFromReport and buildEmployeeMatcher be imported for testing.</w:t>
+        <w:t xml:space="preserve">scripts/hr-payroll-barter-workflow.mjs. Sets the statuses to Started, reads the period dates, runs the report, and fails if it returns no redemptions at all (any promotion). Keeps rows whose Promotion is BARTER (trimmed, case-insensitive) and whose Date is inside the period. Refuses to run if any column it reads is missing from the report, or if a BARTER row has no Order Number. Creates new rows, then matches people and writes the final statuses and a Notes entry. HR_BARTER_SKIP_RUN=1 lets barterRowsFromReport and buildPersonMatcher be imported for testing.</w:t>
       </w:r>
     </w:p>
     <w:p>
@@ -169,20 +174,30 @@
     </w:p>
     <w:p>
       <w:r>
-        <w:t xml:space="preserve">Order numbers are unique in MTEK — in the reference period all 92 BARTER rows had distinct order numbers — so an Order Number already anywhere in the Barter table is never imported again. A re-run lists, without overwriting, rows whose Date or Discount Amount differs from MTEK and rows on the period that are no longer BARTER in MTEK. Rows still missing an employee are re-matched on every run.</w:t>
-      </w:r>
-    </w:p>
-    <w:p>
-      <w:pPr>
-        <w:pStyle w:val="Heading2"/>
-      </w:pPr>
-      <w:r>
-        <w:t xml:space="preserve">9. Employee Matching</w:t>
-      </w:r>
-    </w:p>
-    <w:p>
-      <w:r>
-        <w:t xml:space="preserve">Against the Active Employees - ALL view: customer email against Email and Zingfit e-mail, then full name against Name. A key shared by two active employees is ambiguous and left unmatched rather than guessed. Unmatched customers are listed by name and email in Barter Notes.</w:t>
+        <w:t xml:space="preserve">Order numbers are unique in MTEK — in the reference period all 92 BARTER rows had distinct order numbers — so an Order Number already anywhere in the Barter table is never imported again. A re-run lists, without overwriting, rows whose Date or Discount Amount differs from MTEK and rows on the period that are no longer BARTER in MTEK. Rows with neither an employee nor an instructor are re-matched on every run, so fixing someone's email in Airtable and clicking Fetch Barter again fills them in.</w:t>
+      </w:r>
+    </w:p>
+    <w:p>
+      <w:pPr>
+        <w:pStyle w:val="Heading2"/>
+      </w:pPr>
+      <w:r>
+        <w:t xml:space="preserve">9. Employee / Instructor Matching</w:t>
+      </w:r>
+    </w:p>
+    <w:p>
+      <w:r>
+        <w:t xml:space="preserve">- First against the Active Employees - ALL view: customer email against Email and Zingfit e-mail, then full name against Name.</w:t>
+      </w:r>
+    </w:p>
+    <w:p>
+      <w:r>
+        <w:t xml:space="preserve">- Only if no employee matches, the same rule runs against the Instructors table, every status except Inactive (it has no active-only view), filling the separate Instructor link.</w:t>
+      </w:r>
+    </w:p>
+    <w:p>
+      <w:r>
+        <w:t xml:space="preserve">- A key shared by two people in the same list is ambiguous and left unmatched rather than guessed. Customers matching neither are listed by name and email in Barter Notes.</w:t>
       </w:r>
     </w:p>
     <w:p>
@@ -205,12 +220,12 @@
     </w:p>
     <w:p>
       <w:r>
-        <w:t xml:space="preserve">- Barter Employee Status becomes COMPLETE - Employees assigned, or PROBLEM if any redemption on the period has no employee.</w:t>
-      </w:r>
-    </w:p>
-    <w:p>
-      <w:r>
-        <w:t xml:space="preserve">- Barter Overall Status is COMPLETE only when every redemption has an employee; otherwise PROBLEM. A crash marks the phase in flight PROBLEM.</w:t>
+        <w:t xml:space="preserve">- Barter Employee Status becomes COMPLETE - Employees assigned when every redemption on the period has an employee or an instructor, otherwise PROBLEM.</w:t>
+      </w:r>
+    </w:p>
+    <w:p>
+      <w:r>
+        <w:t xml:space="preserve">- Barter Overall Status is COMPLETE only in that same case; otherwise PROBLEM. A crash marks the phase in flight PROBLEM.</w:t>
       </w:r>
     </w:p>
     <w:p>
@@ -223,35 +238,73 @@
         <w:pStyle w:val="Heading2"/>
       </w:pPr>
       <w:r>
-        <w:t xml:space="preserve">11. Airtable Schema Touched</w:t>
-      </w:r>
-    </w:p>
-    <w:p>
-      <w:r>
-        <w:t xml:space="preserve">- Barter (tblYxeSSem1plIvIR): Order Number (primary), Payroll period, Employee, Customer ID, Customer Name, Customer Email, Discount Amount, Promotion, Promo Code, Order Products, Date.</w:t>
-      </w:r>
-    </w:p>
-    <w:p>
-      <w:r>
-        <w:t xml:space="preserve">- Payroll period (tbl9qw4kqw0BY0DyJ): Barter Status, Barter Employee Status, Barter Overall Status, Barter Notes, Fetch Barter (formula).</w:t>
-      </w:r>
-    </w:p>
-    <w:p>
-      <w:r>
-        <w:t xml:space="preserve">- Employees (tbl0FzJ2s4Mk5jWIi): read only, through view viws8tSbvXfujLnwG.</w:t>
-      </w:r>
-    </w:p>
-    <w:p>
-      <w:pPr>
-        <w:pStyle w:val="Heading2"/>
-      </w:pPr>
-      <w:r>
-        <w:t xml:space="preserve">12. Troubleshooting Guide</w:t>
-      </w:r>
-    </w:p>
-    <w:p>
-      <w:r>
-        <w:t xml:space="preserve">- Employee Status PROBLEM: read Barter Notes for the unmatched customers. Fix the employee's Email (or Zingfit e-mail) in HR so it equals their MTEK email, or make sure they are in the active view, then click Fetch Barter again.</w:t>
+        <w:t xml:space="preserve">11. Payroll Period Checks</w:t>
+      </w:r>
+    </w:p>
+    <w:p>
+      <w:r>
+        <w:t xml:space="preserve">Airtable-only fields, modelled on the time punch checks. The API cannot create conditional counts, so a Barter formula (Payroll issues) lists what is wrong with each redemption and Payroll period counts each issue with a rollup:</w:t>
+      </w:r>
+    </w:p>
+    <w:p>
+      <w:r>
+        <w:t xml:space="preserve">- Barter No Employee/Instructor and its ALL GOOD / ISSUE check.</w:t>
+      </w:r>
+    </w:p>
+    <w:p>
+      <w:r>
+        <w:t xml:space="preserve">- Barter No Desjardins ID and its ALL GOOD / ISSUE check.</w:t>
+      </w:r>
+    </w:p>
+    <w:p>
+      <w:r>
+        <w:t xml:space="preserve">- MIN Date Barter / MAX Date Barter feed Barter Date Range Check, which only requires every redemption to fall within Start and End (barter is not used every day, unlike time punches). A period with no barter reads ALL GOOD.</w:t>
+      </w:r>
+    </w:p>
+    <w:p>
+      <w:pPr>
+        <w:pStyle w:val="Heading2"/>
+      </w:pPr>
+      <w:r>
+        <w:t xml:space="preserve">12. Airtable Schema Touched</w:t>
+      </w:r>
+    </w:p>
+    <w:p>
+      <w:r>
+        <w:t xml:space="preserve">- Barter (tblYxeSSem1plIvIR), written by the script: Order Number (primary), Payroll period, Employee, Instructor, Customer ID, Customer Name, Customer Email, Discount Amount, Promotion, Promo Code, Order Products, Date.</w:t>
+      </w:r>
+    </w:p>
+    <w:p>
+      <w:r>
+        <w:t xml:space="preserve">- Barter, computed: Employee Desjardins ID and Instructor Desjardins ID (lookups), Desjardins ID (employee's, else instructor's), Payroll issues, MTEK Profile (link to bcycle.marianatek.com/admin/user/profile/&lt;Customer ID&gt;).</w:t>
+      </w:r>
+    </w:p>
+    <w:p>
+      <w:r>
+        <w:t xml:space="preserve">- Payroll period (tbl9qw4kqw0BY0DyJ): Barter Status, Barter Employee Status, Barter Overall Status, Barter Notes, Fetch Barter (formula), plus the section 11 checks.</w:t>
+      </w:r>
+    </w:p>
+    <w:p>
+      <w:r>
+        <w:t xml:space="preserve">- Employees (tbl0FzJ2s4Mk5jWIi, view viws8tSbvXfujLnwG) and Instructors (tblGfu4QRovWm7oX0): read only.</w:t>
+      </w:r>
+    </w:p>
+    <w:p>
+      <w:pPr>
+        <w:pStyle w:val="Heading2"/>
+      </w:pPr>
+      <w:r>
+        <w:t xml:space="preserve">13. Troubleshooting Guide</w:t>
+      </w:r>
+    </w:p>
+    <w:p>
+      <w:r>
+        <w:t xml:space="preserve">- Employee Status PROBLEM or the No Employee/Instructor check reads ISSUE: read Barter Notes for the unmatched customers. Make their Email (or Zingfit e-mail) in Employees or Instructors equal their MTEK email, then click Fetch Barter again.</w:t>
+      </w:r>
+    </w:p>
+    <w:p>
+      <w:r>
+        <w:t xml:space="preserve">- No Desjardins ID check reads ISSUE: filter Barter on Payroll issues; the linked employee or instructor is missing DESJARDINS ID. Filling it in clears the check without a re-fetch.</w:t>
       </w:r>
     </w:p>
     <w:p>
@@ -274,12 +327,17 @@
         <w:pStyle w:val="Heading2"/>
       </w:pPr>
       <w:r>
-        <w:t xml:space="preserve">13. Known Data Issues</w:t>
-      </w:r>
-    </w:p>
-    <w:p>
-      <w:r>
-        <w:t xml:space="preserve">- In the first period 13 BARTER customers had no active-employee match. Most use a personal email in MTEK that differs from HR; some may be instructors whose record lives only in HR - Instructors. These need a data fix, not a code fix.</w:t>
+        <w:t xml:space="preserve">14. Known Data Issues</w:t>
+      </w:r>
+    </w:p>
+    <w:p>
+      <w:r>
+        <w:t xml:space="preserve">- Most barter customers who are not employees are instructors; before the instructor fallback, 13 customers in the first period had no match. After it, one customer remains unmatched: their MTEK email matches nobody in Employees or Instructors.</w:t>
+      </w:r>
+    </w:p>
+    <w:p>
+      <w:r>
+        <w:t xml:space="preserve">- One employee in the first period has no DESJARDINS ID on their Employees record, so their redemptions show a blank Desjardins ID.</w:t>
       </w:r>
     </w:p>
     <w:p>
@@ -297,25 +355,25 @@
         <w:pStyle w:val="Heading2"/>
       </w:pPr>
       <w:r>
-        <w:t xml:space="preserve">14. Verification Record</w:t>
-      </w:r>
-    </w:p>
-    <w:p>
-      <w:r>
-        <w:t xml:space="preserve">Reference period 2026-08-23 to 2026-09-05. MTEK returned 412 redemptions across all promotions, 92 of them BARTER, every one with a unique order number. Run 1 created 92 rows, all linked to the period; 69 matched an employee and 23 (13 customers) did not, so Overall read PROBLEM as designed. Run 2 created 0 and skipped 92. Offline tests: 10 of 10 passed (promotion filter, date window, missing column, blank order number, email/Zingfit/name matching, ambiguous name).</w:t>
-      </w:r>
-    </w:p>
-    <w:p>
-      <w:pPr>
-        <w:pStyle w:val="Heading2"/>
-      </w:pPr>
-      <w:r>
-        <w:t xml:space="preserve">15. Summary</w:t>
-      </w:r>
-    </w:p>
-    <w:p>
-      <w:r>
-        <w:t xml:space="preserve">One click per pay period imports that period's BARTER redemptions from MTEK report 292, deduplicated on order number, linked to the period and to the employee, with statuses that read COMPLETE only when every redemption is accounted for.</w:t>
+        <w:t xml:space="preserve">15. Verification Record</w:t>
+      </w:r>
+    </w:p>
+    <w:p>
+      <w:r>
+        <w:t xml:space="preserve">Reference period 2026-08-23 to 2026-09-05. MTEK returned 412 redemptions across all promotions, 92 of them BARTER, every one with a unique order number. Run 1 created 92 rows, all linked to the period; 69 matched an employee, 23 did not. Run 2 created 0 and skipped 92. After the instructor fallback, a re-run matched 22 of the 23 to an instructor, leaving 1. Checks on that period: No Employee/Instructor 1 (ISSUE), No Desjardins ID 3 (ISSUE), Date Range ALL GOOD (2026-08-23 to 2026-09-05); the two empty periods read ALL GOOD. Offline tests: 13 of 13 passed (promotion filter, date window, missing column, blank order number, email / Zingfit / name matching, ambiguity, instructor fallback, inactive instructor skipped).</w:t>
+      </w:r>
+    </w:p>
+    <w:p>
+      <w:pPr>
+        <w:pStyle w:val="Heading2"/>
+      </w:pPr>
+      <w:r>
+        <w:t xml:space="preserve">16. Summary</w:t>
+      </w:r>
+    </w:p>
+    <w:p>
+      <w:r>
+        <w:t xml:space="preserve">One click per pay period imports that period's BARTER redemptions from MTEK report 292, deduplicated on order number, linked to the period and to the employee or instructor with their Desjardins ID, with statuses and checks that read COMPLETE / ALL GOOD only when every redemption is accounted for.</w:t>
       </w:r>
     </w:p>
     <w:sectPr>

</xml_diff>